<commit_message>
docs(db): reescribir el diccionario en espanol neutro
Incluye las reglas de autorizacion ya aplicadas y una explicacion junto a cada tabla.

Co-authored-by: Cursor <cursoragent@cursor.com>
</commit_message>
<xml_diff>
--- a/docs/DICCIONARIO_BASE_DATOS.docx
+++ b/docs/DICCIONARIO_BASE_DATOS.docx
@@ -49,9 +49,9 @@
         </w:rPr>
         <w:t>Documento técnico de esquema · PostgreSQL / Supabase</w:t>
         <w:br/>
-        <w:t>Versión 1.4 · 14 de septiembre de 2026</w:t>
+        <w:t>Versión 1.5 · 19 de septiembre de 2026</w:t>
         <w:br/>
-        <w:t>Convención: español neutro · snake_case</w:t>
+        <w:t>Español neutro · snake_case</w:t>
       </w:r>
     </w:p>
     <w:p>
@@ -428,7 +428,7 @@
                 <w:b w:val="0"/>
                 <w:sz w:val="20"/>
               </w:rPr>
-              <w:t>1.4</w:t>
+              <w:t>1.5</w:t>
             </w:r>
           </w:p>
         </w:tc>
@@ -468,7 +468,7 @@
                 <w:b w:val="0"/>
                 <w:sz w:val="20"/>
               </w:rPr>
-              <w:t>2026-09-14</w:t>
+              <w:t>2026-09-19</w:t>
             </w:r>
           </w:p>
         </w:tc>
@@ -508,7 +508,7 @@
                 <w:b w:val="0"/>
                 <w:sz w:val="20"/>
               </w:rPr>
-              <w:t>Rename ES (04) aplicado; RLS (05) confirmado en tablas núcleo; seed marketplace (06) en repositorio; hardening 20260915 pendiente de apply remoto.</w:t>
+              <w:t>Rename, RLS, catálogo, hardening y las correcciones del 19 de septiembre aplicados en el servidor.</w:t>
             </w:r>
           </w:p>
         </w:tc>
@@ -594,7 +594,7 @@
           <w:b w:val="0"/>
           <w:sz w:val="22"/>
         </w:rPr>
-        <w:t>En términos simples: si se cambia un nombre de columna o un estado sin actualizar este documento y el código, se rompe el flujo entre aplicaciones. Esta es la referencia compartida para no inventar nombres distintos entre móvil, web y escritorio.</w:t>
+        <w:t>Cómo leerlo: la sección 3 es el índice de las 28 tablas. La sección 4 lista los textos exactos de estado; hay que copiarlos tal cual. La sección 7 explica quién puede leer o cambiar cada dato, incluidas las funciones corregidas el 19 de septiembre de 2026.</w:t>
       </w:r>
     </w:p>
     <w:p>
@@ -5447,7 +5447,7 @@
           <w:b w:val="0"/>
           <w:sz w:val="22"/>
         </w:rPr>
-        <w:t>id, id_trabajo, id_orden_cambio, tipo_pago, monto, moneda (CLP), estado, metodo_pago, id_transaccion, autorizado_en, liberado_en, reembolsado_en, creado_en, actualizado_en. Importante: en las aplicaciones cliente el flujo de pasarela es simulación académica; no hay cobro real integrado. Las actualizaciones de estado deben hacerse con simular_transicion_pago (RPC), no con UPDATE directo.</w:t>
+        <w:t>id, id_trabajo, id_orden_cambio, tipo_pago, monto, moneda (CLP), estado, metodo_pago, id_transaccion, autorizado_en, liberado_en, reembolsado_en, creado_en, actualizado_en. No hay pasarela real. El cambio de estado se hace con simular_transicion_pago. El cliente y el administrador usan la matriz completa. El profesional solo retiene el cobro, libera si el trabajo ya está completado y reembolsa si ya está cancelado.</w:t>
       </w:r>
     </w:p>
     <w:p>
@@ -6700,7 +6700,7 @@
                 <w:b w:val="0"/>
                 <w:sz w:val="20"/>
               </w:rPr>
-              <w:t>simular_transicion_pago(...)</w:t>
+              <w:t>es_rol_trabajador(text)</w:t>
             </w:r>
           </w:p>
         </w:tc>
@@ -6719,7 +6719,7 @@
                 <w:b w:val="0"/>
                 <w:sz w:val="20"/>
               </w:rPr>
-              <w:t>Mock de escrow en servidor (sin cobro real)</w:t>
+              <w:t>La persona es profesional activo (incluye alias worker, especialista, specialist)</w:t>
             </w:r>
           </w:p>
         </w:tc>
@@ -6740,6 +6740,46 @@
                 <w:b w:val="0"/>
                 <w:sz w:val="20"/>
               </w:rPr>
+              <w:t>simular_transicion_pago(...)</w:t>
+            </w:r>
+          </w:p>
+        </w:tc>
+        <w:tc>
+          <w:tcPr>
+            <w:tcW w:type="dxa" w:w="4703"/>
+          </w:tcPr>
+          <w:p>
+            <w:pPr>
+              <w:spacing w:after="40" w:before="40" w:line="240" w:lineRule="auto"/>
+            </w:pPr>
+            <w:r/>
+            <w:r>
+              <w:rPr>
+                <w:rFonts w:ascii="Calibri" w:hAnsi="Calibri" w:eastAsia="Calibri"/>
+                <w:b w:val="0"/>
+                <w:sz w:val="20"/>
+              </w:rPr>
+              <w:t>Pago simulado. El profesional no libera ni reembolsa si el trabajo sigue abierto</w:t>
+            </w:r>
+          </w:p>
+        </w:tc>
+      </w:tr>
+      <w:tr>
+        <w:tc>
+          <w:tcPr>
+            <w:tcW w:type="dxa" w:w="4703"/>
+          </w:tcPr>
+          <w:p>
+            <w:pPr>
+              <w:spacing w:after="40" w:before="40" w:line="240" w:lineRule="auto"/>
+            </w:pPr>
+            <w:r/>
+            <w:r>
+              <w:rPr>
+                <w:rFonts w:ascii="Calibri" w:hAnsi="Calibri" w:eastAsia="Calibri"/>
+                <w:b w:val="0"/>
+                <w:sz w:val="20"/>
+              </w:rPr>
               <w:t>asignar_trabajador_trabajo(...)</w:t>
             </w:r>
           </w:p>
@@ -6759,7 +6799,47 @@
                 <w:b w:val="0"/>
                 <w:sz w:val="20"/>
               </w:rPr>
-              <w:t>Asigna profesional y pasa a aceptado</w:t>
+              <w:t>Acepta el trabajo. El destino debe ser profesional activo. Un cliente no puede autoasignarse</w:t>
+            </w:r>
+          </w:p>
+        </w:tc>
+      </w:tr>
+      <w:tr>
+        <w:tc>
+          <w:tcPr>
+            <w:tcW w:type="dxa" w:w="4703"/>
+          </w:tcPr>
+          <w:p>
+            <w:pPr>
+              <w:spacing w:after="40" w:before="40" w:line="240" w:lineRule="auto"/>
+            </w:pPr>
+            <w:r/>
+            <w:r>
+              <w:rPr>
+                <w:rFonts w:ascii="Calibri" w:hAnsi="Calibri" w:eastAsia="Calibri"/>
+                <w:b w:val="0"/>
+                <w:sz w:val="20"/>
+              </w:rPr>
+              <w:t>rechazar_trabajo_pendiente(...)</w:t>
+            </w:r>
+          </w:p>
+        </w:tc>
+        <w:tc>
+          <w:tcPr>
+            <w:tcW w:type="dxa" w:w="4703"/>
+          </w:tcPr>
+          <w:p>
+            <w:pPr>
+              <w:spacing w:after="40" w:before="40" w:line="240" w:lineRule="auto"/>
+            </w:pPr>
+            <w:r/>
+            <w:r>
+              <w:rPr>
+                <w:rFonts w:ascii="Calibri" w:hAnsi="Calibri" w:eastAsia="Calibri"/>
+                <w:b w:val="0"/>
+                <w:sz w:val="20"/>
+              </w:rPr>
+              <w:t>Cancela un pendiente. Si no hay profesional asignado, se detiene</w:t>
             </w:r>
           </w:p>
         </w:tc>
@@ -6857,7 +6937,7 @@
           <w:b w:val="0"/>
           <w:sz w:val="22"/>
         </w:rPr>
-        <w:t>Si se invocan RPC de administrador sin sesión de administrador, se observará un error del tipo «Solo administradores» (HTTP 400 típico). Un 404 indicaría que la función no existe.</w:t>
+        <w:t>Regla del pago simulado: el cliente y el administrador pueden autorizar, retener, liberar y reembolsar según la matriz. El profesional asignado solo retiene el cobro; libera únicamente si el trabajo ya está completado y reembolsa únicamente si ya está cancelado. Un cliente no puede aceptar un trabajo a su nombre.</w:t>
       </w:r>
     </w:p>
     <w:p>
@@ -7237,7 +7317,7 @@
                 <w:b w:val="0"/>
                 <w:sz w:val="20"/>
               </w:rPr>
-              <w:t>Aplicar hardening 20260915 en remoto</w:t>
+              <w:t>Autorización de trabajo y pago</w:t>
             </w:r>
           </w:p>
         </w:tc>
@@ -7275,7 +7355,7 @@
                 <w:b w:val="0"/>
                 <w:sz w:val="20"/>
               </w:rPr>
-              <w:t>El script está en el repositorio; la seguridad efectiva depende de aplicarlo en Supabase.</w:t>
+              <w:t>Cerrado en el servidor el 19 de septiembre de 2026.</w:t>
             </w:r>
           </w:p>
         </w:tc>
@@ -7543,7 +7623,7 @@
           <w:b w:val="0"/>
           <w:sz w:val="22"/>
         </w:rPr>
-        <w:t>docs/mapa_esquema_en_es.md · docs/APLICAR_MIGRACION_ES.md · docs/APLICAR_HARDENING_20260915.md · docs/AUDITORIA_PROYECTO.md · docs/DICCIONARIO_BASE_DATOS.md · myworksapp_app/supabase/migrations/20260914000004_aplicar_rename_es.sql · 20260914000005_rls_politicas_negocio.sql · 20260914000006_seed_servicios_marketplace.sql · 20260915000001_hardening_seguridad_sin_psp.sql</w:t>
+        <w:t>docs/mapa_esquema_en_es.md · docs/APLICAR_MIGRACION_ES.md · docs/APLICAR_HARDENING_20260915.md · docs/AUDITORIA_PROYECTO.md · docs/DICCIONARIO_BASE_DATOS.md · myworksapp_app/supabase/migrations/20260914000004_aplicar_rename_es.sql · 20260914000005_rls_politicas_negocio.sql · 20260914000006_seed_servicios_marketplace.sql · 20260915000001_hardening_seguridad_sin_psp.sql · 20260919000001_fix_rpc_autorizacion.sql · 20260919000002_pago_al_cerrar_trabajo.sql</w:t>
       </w:r>
     </w:p>
     <w:p>

</xml_diff>